<commit_message>
Add matric number to submission documents
Co-Authored-By: Claude Opus 5.5 <noreply@anthropic.com>
</commit_message>
<xml_diff>
--- a/docs/srs/IRO_SRS.docx
+++ b/docs/srs/IRO_SRS.docx
@@ -95,7 +95,11 @@
       </w:pPr>
       <w:r>
         <w:rPr/>
-        <w:t>Prepared by: Joshua Omolafe (GitHub: Joshua989)</w:t>
+        <w:t>Prepared by: Joshua Omolafe</w:t>
+        <w:br/>
+        <w:t>Matric No.: 220404244</w:t>
+        <w:br/>
+        <w:t>GitHub: Joshua989</w:t>
       </w:r>
     </w:p>
     <w:p>

</xml_diff>